<commit_message>
Deber Jenkins (documento Word actualizado - cierre final)
</commit_message>
<xml_diff>
--- a/jenkins-deber/Automatizacion_Pipeline_Jenkins_Hernan_Jurado.docx
+++ b/jenkins-deber/Automatizacion_Pipeline_Jenkins_Hernan_Jurado.docx
@@ -35,16 +35,14 @@
         </w:rPr>
         <w:t xml:space="preserve">Facultad de </w:t>
       </w:r>
-      <w:proofErr w:type="spellStart"/>
       <w:r>
         <w:rPr>
           <w:i/>
           <w:sz w:val="24"/>
           <w:lang w:val="es-EC"/>
         </w:rPr>
-        <w:t>Ingenieria</w:t>
-      </w:r>
-      <w:proofErr w:type="spellEnd"/>
+        <w:t>Ingeniería</w:t>
+      </w:r>
       <w:r>
         <w:rPr>
           <w:i/>
@@ -1142,7 +1140,27 @@
           <w:sz w:val="18"/>
           <w:lang w:val="es-EC"/>
         </w:rPr>
-        <w:t xml:space="preserve"> REUTILIZABLES (cargados con load())</w:t>
+        <w:t xml:space="preserve"> REUTILIZABLES (cargados con </w:t>
+      </w:r>
+      <w:proofErr w:type="gramStart"/>
+      <w:r>
+        <w:rPr>
+          <w:rFonts w:ascii="Consolas" w:hAnsi="Consolas"/>
+          <w:color w:val="333333"/>
+          <w:sz w:val="18"/>
+          <w:lang w:val="es-EC"/>
+        </w:rPr>
+        <w:t>load(</w:t>
+      </w:r>
+      <w:proofErr w:type="gramEnd"/>
+      <w:r>
+        <w:rPr>
+          <w:rFonts w:ascii="Consolas" w:hAnsi="Consolas"/>
+          <w:color w:val="333333"/>
+          <w:sz w:val="18"/>
+          <w:lang w:val="es-EC"/>
+        </w:rPr>
+        <w:t>))</w:t>
       </w:r>
       <w:r>
         <w:rPr>
@@ -1155,6 +1173,7 @@
         <w:t xml:space="preserve">|   |-- </w:t>
       </w:r>
       <w:proofErr w:type="spellStart"/>
+      <w:proofErr w:type="gramStart"/>
       <w:r>
         <w:rPr>
           <w:rFonts w:ascii="Consolas" w:hAnsi="Consolas"/>
@@ -1165,6 +1184,7 @@
         <w:t>build.groovy</w:t>
       </w:r>
       <w:proofErr w:type="spellEnd"/>
+      <w:proofErr w:type="gramEnd"/>
       <w:r>
         <w:rPr>
           <w:rFonts w:ascii="Consolas" w:hAnsi="Consolas"/>
@@ -1176,6 +1196,7 @@
         <w:t xml:space="preserve">|   |-- </w:t>
       </w:r>
       <w:proofErr w:type="spellStart"/>
+      <w:proofErr w:type="gramStart"/>
       <w:r>
         <w:rPr>
           <w:rFonts w:ascii="Consolas" w:hAnsi="Consolas"/>
@@ -1186,6 +1207,7 @@
         <w:t>test.groovy</w:t>
       </w:r>
       <w:proofErr w:type="spellEnd"/>
+      <w:proofErr w:type="gramEnd"/>
       <w:r>
         <w:rPr>
           <w:rFonts w:ascii="Consolas" w:hAnsi="Consolas"/>
@@ -1197,6 +1219,7 @@
         <w:t xml:space="preserve">|   `-- </w:t>
       </w:r>
       <w:proofErr w:type="spellStart"/>
+      <w:proofErr w:type="gramStart"/>
       <w:r>
         <w:rPr>
           <w:rFonts w:ascii="Consolas" w:hAnsi="Consolas"/>
@@ -1207,6 +1230,7 @@
         <w:t>report.groovy</w:t>
       </w:r>
       <w:proofErr w:type="spellEnd"/>
+      <w:proofErr w:type="gramEnd"/>
       <w:r>
         <w:rPr>
           <w:rFonts w:ascii="Consolas" w:hAnsi="Consolas"/>
@@ -2137,7 +2161,21 @@
         <w:rPr>
           <w:lang w:val="es-EC"/>
         </w:rPr>
-        <w:t xml:space="preserve"> es el archivo central que define el pipeline. Esta escrito en sintaxis declarativa de </w:t>
+        <w:t xml:space="preserve"> es el archivo central que define el pipeline. </w:t>
+      </w:r>
+      <w:proofErr w:type="gramStart"/>
+      <w:r>
+        <w:rPr>
+          <w:lang w:val="es-EC"/>
+        </w:rPr>
+        <w:t>Esta escrito</w:t>
+      </w:r>
+      <w:proofErr w:type="gramEnd"/>
+      <w:r>
+        <w:rPr>
+          <w:lang w:val="es-EC"/>
+        </w:rPr>
+        <w:t xml:space="preserve"> en sintaxis declarativa de </w:t>
       </w:r>
       <w:proofErr w:type="spellStart"/>
       <w:r>
@@ -2389,7 +2427,27 @@
           <w:lang w:val="es-EC"/>
         </w:rPr>
         <w:br/>
-        <w:t xml:space="preserve">        APP_VERSION = "1.0.${BUILD_NUMBER}"</w:t>
+        <w:t xml:space="preserve">        APP_VERSION = "1.</w:t>
+      </w:r>
+      <w:proofErr w:type="gramStart"/>
+      <w:r>
+        <w:rPr>
+          <w:rFonts w:ascii="Consolas" w:hAnsi="Consolas"/>
+          <w:color w:val="333333"/>
+          <w:sz w:val="18"/>
+          <w:lang w:val="es-EC"/>
+        </w:rPr>
+        <w:t>0.$</w:t>
+      </w:r>
+      <w:proofErr w:type="gramEnd"/>
+      <w:r>
+        <w:rPr>
+          <w:rFonts w:ascii="Consolas" w:hAnsi="Consolas"/>
+          <w:color w:val="333333"/>
+          <w:sz w:val="18"/>
+          <w:lang w:val="es-EC"/>
+        </w:rPr>
+        <w:t>{BUILD_NUMBER}"</w:t>
       </w:r>
       <w:r>
         <w:rPr>
@@ -2402,14 +2460,25 @@
         <w:t xml:space="preserve">        RAMA_ACTUAL = "${</w:t>
       </w:r>
       <w:proofErr w:type="spellStart"/>
-      <w:r>
-        <w:rPr>
-          <w:rFonts w:ascii="Consolas" w:hAnsi="Consolas"/>
-          <w:color w:val="333333"/>
-          <w:sz w:val="18"/>
-          <w:lang w:val="es-EC"/>
-        </w:rPr>
-        <w:t>env.BRANCH_NAME</w:t>
+      <w:proofErr w:type="gramStart"/>
+      <w:r>
+        <w:rPr>
+          <w:rFonts w:ascii="Consolas" w:hAnsi="Consolas"/>
+          <w:color w:val="333333"/>
+          <w:sz w:val="18"/>
+          <w:lang w:val="es-EC"/>
+        </w:rPr>
+        <w:t>env.BRANCH</w:t>
+      </w:r>
+      <w:proofErr w:type="gramEnd"/>
+      <w:r>
+        <w:rPr>
+          <w:rFonts w:ascii="Consolas" w:hAnsi="Consolas"/>
+          <w:color w:val="333333"/>
+          <w:sz w:val="18"/>
+          <w:lang w:val="es-EC"/>
+        </w:rPr>
+        <w:t>_NAME</w:t>
       </w:r>
       <w:proofErr w:type="spellEnd"/>
       <w:r>
@@ -2429,8 +2498,19 @@
           <w:lang w:val="es-EC"/>
         </w:rPr>
         <w:br/>
-        <w:t xml:space="preserve">    }</w:t>
-      </w:r>
+        <w:t xml:space="preserve">  </w:t>
+      </w:r>
+      <w:proofErr w:type="gramStart"/>
+      <w:r>
+        <w:rPr>
+          <w:rFonts w:ascii="Consolas" w:hAnsi="Consolas"/>
+          <w:color w:val="333333"/>
+          <w:sz w:val="18"/>
+          <w:lang w:val="es-EC"/>
+        </w:rPr>
+        <w:t xml:space="preserve">  }</w:t>
+      </w:r>
+      <w:proofErr w:type="gramEnd"/>
       <w:r>
         <w:rPr>
           <w:rFonts w:ascii="Consolas" w:hAnsi="Consolas"/>
@@ -2481,6 +2561,7 @@
         <w:t xml:space="preserve">        </w:t>
       </w:r>
       <w:proofErr w:type="spellStart"/>
+      <w:proofErr w:type="gramStart"/>
       <w:r>
         <w:rPr>
           <w:rFonts w:ascii="Consolas" w:hAnsi="Consolas"/>
@@ -2498,7 +2579,17 @@
           <w:sz w:val="18"/>
           <w:lang w:val="es-EC"/>
         </w:rPr>
-        <w:t xml:space="preserve">(time: 10, </w:t>
+        <w:t>(</w:t>
+      </w:r>
+      <w:proofErr w:type="gramEnd"/>
+      <w:r>
+        <w:rPr>
+          <w:rFonts w:ascii="Consolas" w:hAnsi="Consolas"/>
+          <w:color w:val="333333"/>
+          <w:sz w:val="18"/>
+          <w:lang w:val="es-EC"/>
+        </w:rPr>
+        <w:t xml:space="preserve">time: 10, </w:t>
       </w:r>
       <w:proofErr w:type="spellStart"/>
       <w:r>
@@ -2531,6 +2622,7 @@
         <w:t xml:space="preserve">        </w:t>
       </w:r>
       <w:proofErr w:type="spellStart"/>
+      <w:proofErr w:type="gramStart"/>
       <w:r>
         <w:rPr>
           <w:rFonts w:ascii="Consolas" w:hAnsi="Consolas"/>
@@ -2571,6 +2663,7 @@
         <w:t>(</w:t>
       </w:r>
       <w:proofErr w:type="spellStart"/>
+      <w:proofErr w:type="gramEnd"/>
       <w:r>
         <w:rPr>
           <w:rFonts w:ascii="Consolas" w:hAnsi="Consolas"/>
@@ -2601,6 +2694,7 @@
         <w:t xml:space="preserve">        </w:t>
       </w:r>
       <w:proofErr w:type="spellStart"/>
+      <w:proofErr w:type="gramStart"/>
       <w:r>
         <w:rPr>
           <w:rFonts w:ascii="Consolas" w:hAnsi="Consolas"/>
@@ -2618,7 +2712,17 @@
           <w:sz w:val="18"/>
           <w:lang w:val="es-EC"/>
         </w:rPr>
-        <w:t>()</w:t>
+        <w:t>(</w:t>
+      </w:r>
+      <w:proofErr w:type="gramEnd"/>
+      <w:r>
+        <w:rPr>
+          <w:rFonts w:ascii="Consolas" w:hAnsi="Consolas"/>
+          <w:color w:val="333333"/>
+          <w:sz w:val="18"/>
+          <w:lang w:val="es-EC"/>
+        </w:rPr>
+        <w:t>)</w:t>
       </w:r>
       <w:r>
         <w:rPr>
@@ -2628,8 +2732,19 @@
           <w:lang w:val="es-EC"/>
         </w:rPr>
         <w:br/>
-        <w:t xml:space="preserve">    }</w:t>
-      </w:r>
+        <w:t xml:space="preserve">  </w:t>
+      </w:r>
+      <w:proofErr w:type="gramStart"/>
+      <w:r>
+        <w:rPr>
+          <w:rFonts w:ascii="Consolas" w:hAnsi="Consolas"/>
+          <w:color w:val="333333"/>
+          <w:sz w:val="18"/>
+          <w:lang w:val="es-EC"/>
+        </w:rPr>
+        <w:t xml:space="preserve">  }</w:t>
+      </w:r>
+      <w:proofErr w:type="gramEnd"/>
       <w:r>
         <w:rPr>
           <w:rFonts w:ascii="Consolas" w:hAnsi="Consolas"/>
@@ -2687,8 +2802,19 @@
           <w:lang w:val="es-EC"/>
         </w:rPr>
         <w:br/>
-        <w:t xml:space="preserve">    }</w:t>
-      </w:r>
+        <w:t xml:space="preserve">  </w:t>
+      </w:r>
+      <w:proofErr w:type="gramStart"/>
+      <w:r>
+        <w:rPr>
+          <w:rFonts w:ascii="Consolas" w:hAnsi="Consolas"/>
+          <w:color w:val="333333"/>
+          <w:sz w:val="18"/>
+          <w:lang w:val="es-EC"/>
+        </w:rPr>
+        <w:t xml:space="preserve">  }</w:t>
+      </w:r>
+      <w:proofErr w:type="gramEnd"/>
       <w:r>
         <w:rPr>
           <w:rFonts w:ascii="Consolas" w:hAnsi="Consolas"/>
@@ -2736,7 +2862,27 @@
           <w:sz w:val="18"/>
           <w:lang w:val="es-EC"/>
         </w:rPr>
-        <w:t xml:space="preserve"> { ... }</w:t>
+        <w:t xml:space="preserve"> </w:t>
+      </w:r>
+      <w:proofErr w:type="gramStart"/>
+      <w:r>
+        <w:rPr>
+          <w:rFonts w:ascii="Consolas" w:hAnsi="Consolas"/>
+          <w:color w:val="333333"/>
+          <w:sz w:val="18"/>
+          <w:lang w:val="es-EC"/>
+        </w:rPr>
+        <w:t>{ ...</w:t>
+      </w:r>
+      <w:proofErr w:type="gramEnd"/>
+      <w:r>
+        <w:rPr>
+          <w:rFonts w:ascii="Consolas" w:hAnsi="Consolas"/>
+          <w:color w:val="333333"/>
+          <w:sz w:val="18"/>
+          <w:lang w:val="es-EC"/>
+        </w:rPr>
+        <w:t xml:space="preserve"> }</w:t>
       </w:r>
       <w:r>
         <w:rPr>
@@ -2754,7 +2900,25 @@
           <w:color w:val="333333"/>
           <w:sz w:val="18"/>
         </w:rPr>
-        <w:t>failure { ... }</w:t>
+        <w:t xml:space="preserve">failure </w:t>
+      </w:r>
+      <w:proofErr w:type="gramStart"/>
+      <w:r>
+        <w:rPr>
+          <w:rFonts w:ascii="Consolas" w:hAnsi="Consolas"/>
+          <w:color w:val="333333"/>
+          <w:sz w:val="18"/>
+        </w:rPr>
+        <w:t>{ ...</w:t>
+      </w:r>
+      <w:proofErr w:type="gramEnd"/>
+      <w:r>
+        <w:rPr>
+          <w:rFonts w:ascii="Consolas" w:hAnsi="Consolas"/>
+          <w:color w:val="333333"/>
+          <w:sz w:val="18"/>
+        </w:rPr>
+        <w:t xml:space="preserve"> }</w:t>
       </w:r>
       <w:r>
         <w:rPr>
@@ -2763,8 +2927,36 @@
           <w:sz w:val="18"/>
         </w:rPr>
         <w:br/>
-        <w:t xml:space="preserve">        always  { ... }</w:t>
-      </w:r>
+        <w:t xml:space="preserve">        </w:t>
+      </w:r>
+      <w:proofErr w:type="gramStart"/>
+      <w:r>
+        <w:rPr>
+          <w:rFonts w:ascii="Consolas" w:hAnsi="Consolas"/>
+          <w:color w:val="333333"/>
+          <w:sz w:val="18"/>
+        </w:rPr>
+        <w:t>always  {</w:t>
+      </w:r>
+      <w:proofErr w:type="gramEnd"/>
+      <w:r>
+        <w:rPr>
+          <w:rFonts w:ascii="Consolas" w:hAnsi="Consolas"/>
+          <w:color w:val="333333"/>
+          <w:sz w:val="18"/>
+        </w:rPr>
+        <w:t xml:space="preserve"> </w:t>
+      </w:r>
+      <w:proofErr w:type="gramStart"/>
+      <w:r>
+        <w:rPr>
+          <w:rFonts w:ascii="Consolas" w:hAnsi="Consolas"/>
+          <w:color w:val="333333"/>
+          <w:sz w:val="18"/>
+        </w:rPr>
+        <w:t>... }</w:t>
+      </w:r>
+      <w:proofErr w:type="gramEnd"/>
       <w:r>
         <w:rPr>
           <w:rFonts w:ascii="Consolas" w:hAnsi="Consolas"/>
@@ -2772,8 +2964,18 @@
           <w:sz w:val="18"/>
         </w:rPr>
         <w:br/>
-        <w:t xml:space="preserve">    }</w:t>
-      </w:r>
+        <w:t xml:space="preserve">  </w:t>
+      </w:r>
+      <w:proofErr w:type="gramStart"/>
+      <w:r>
+        <w:rPr>
+          <w:rFonts w:ascii="Consolas" w:hAnsi="Consolas"/>
+          <w:color w:val="333333"/>
+          <w:sz w:val="18"/>
+        </w:rPr>
+        <w:t xml:space="preserve">  }</w:t>
+      </w:r>
+      <w:proofErr w:type="gramEnd"/>
       <w:r>
         <w:rPr>
           <w:rFonts w:ascii="Consolas" w:hAnsi="Consolas"/>
@@ -3004,6 +3206,7 @@
               <w:t xml:space="preserve"> </w:t>
             </w:r>
             <w:proofErr w:type="spellStart"/>
+            <w:proofErr w:type="gramStart"/>
             <w:r>
               <w:rPr>
                 <w:sz w:val="20"/>
@@ -3012,6 +3215,7 @@
               <w:t>build.groovy</w:t>
             </w:r>
             <w:proofErr w:type="spellEnd"/>
+            <w:proofErr w:type="gramEnd"/>
             <w:r>
               <w:rPr>
                 <w:sz w:val="20"/>
@@ -3281,6 +3485,7 @@
               <w:t xml:space="preserve">Imprime resumen final usando </w:t>
             </w:r>
             <w:proofErr w:type="spellStart"/>
+            <w:proofErr w:type="gramStart"/>
             <w:r>
               <w:rPr>
                 <w:sz w:val="20"/>
@@ -3289,6 +3494,7 @@
               <w:t>report.groovy</w:t>
             </w:r>
             <w:proofErr w:type="spellEnd"/>
+            <w:proofErr w:type="gramEnd"/>
           </w:p>
         </w:tc>
       </w:tr>
@@ -3533,6 +3739,7 @@
         </w:rPr>
       </w:pPr>
       <w:proofErr w:type="spellStart"/>
+      <w:proofErr w:type="gramStart"/>
       <w:r>
         <w:rPr>
           <w:rFonts w:ascii="Consolas" w:hAnsi="Consolas"/>
@@ -3550,7 +3757,17 @@
           <w:sz w:val="18"/>
           <w:lang w:val="es-EC"/>
         </w:rPr>
-        <w:t xml:space="preserve">('1. </w:t>
+        <w:t>(</w:t>
+      </w:r>
+      <w:proofErr w:type="gramEnd"/>
+      <w:r>
+        <w:rPr>
+          <w:rFonts w:ascii="Consolas" w:hAnsi="Consolas"/>
+          <w:color w:val="333333"/>
+          <w:sz w:val="18"/>
+          <w:lang w:val="es-EC"/>
+        </w:rPr>
+        <w:t xml:space="preserve">'1. </w:t>
       </w:r>
       <w:r>
         <w:rPr>
@@ -3627,14 +3844,25 @@
         <w:t>Produccion</w:t>
       </w:r>
       <w:proofErr w:type="spellEnd"/>
-      <w:r>
-        <w:rPr>
-          <w:rFonts w:ascii="Consolas" w:hAnsi="Consolas"/>
-          <w:color w:val="333333"/>
-          <w:sz w:val="18"/>
-          <w:lang w:val="es-EC"/>
-        </w:rPr>
-        <w:t xml:space="preserve">')  { </w:t>
+      <w:proofErr w:type="gramStart"/>
+      <w:r>
+        <w:rPr>
+          <w:rFonts w:ascii="Consolas" w:hAnsi="Consolas"/>
+          <w:color w:val="333333"/>
+          <w:sz w:val="18"/>
+          <w:lang w:val="es-EC"/>
+        </w:rPr>
+        <w:t>')  {</w:t>
+      </w:r>
+      <w:proofErr w:type="gramEnd"/>
+      <w:r>
+        <w:rPr>
+          <w:rFonts w:ascii="Consolas" w:hAnsi="Consolas"/>
+          <w:color w:val="333333"/>
+          <w:sz w:val="18"/>
+          <w:lang w:val="es-EC"/>
+        </w:rPr>
+        <w:t xml:space="preserve"> </w:t>
       </w:r>
       <w:proofErr w:type="spellStart"/>
       <w:r>
@@ -3654,7 +3882,17 @@
           <w:sz w:val="18"/>
           <w:lang w:val="es-EC"/>
         </w:rPr>
-        <w:t xml:space="preserve"> { </w:t>
+        <w:t xml:space="preserve"> </w:t>
+      </w:r>
+      <w:proofErr w:type="gramStart"/>
+      <w:r>
+        <w:rPr>
+          <w:rFonts w:ascii="Consolas" w:hAnsi="Consolas"/>
+          <w:color w:val="333333"/>
+          <w:sz w:val="18"/>
+          <w:lang w:val="es-EC"/>
+        </w:rPr>
+        <w:t xml:space="preserve">{ </w:t>
       </w:r>
       <w:proofErr w:type="spellStart"/>
       <w:r>
@@ -3667,6 +3905,7 @@
         <w:t>branch</w:t>
       </w:r>
       <w:proofErr w:type="spellEnd"/>
+      <w:proofErr w:type="gramEnd"/>
       <w:r>
         <w:rPr>
           <w:rFonts w:ascii="Consolas" w:hAnsi="Consolas"/>
@@ -3687,15 +3926,37 @@
         <w:t>main</w:t>
       </w:r>
       <w:proofErr w:type="spellEnd"/>
-      <w:r>
-        <w:rPr>
-          <w:rFonts w:ascii="Consolas" w:hAnsi="Consolas"/>
-          <w:color w:val="333333"/>
-          <w:sz w:val="18"/>
-          <w:lang w:val="es-EC"/>
-        </w:rPr>
-        <w:t>' } ... }</w:t>
-      </w:r>
+      <w:proofErr w:type="gramStart"/>
+      <w:r>
+        <w:rPr>
+          <w:rFonts w:ascii="Consolas" w:hAnsi="Consolas"/>
+          <w:color w:val="333333"/>
+          <w:sz w:val="18"/>
+          <w:lang w:val="es-EC"/>
+        </w:rPr>
+        <w:t>' }</w:t>
+      </w:r>
+      <w:proofErr w:type="gramEnd"/>
+      <w:r>
+        <w:rPr>
+          <w:rFonts w:ascii="Consolas" w:hAnsi="Consolas"/>
+          <w:color w:val="333333"/>
+          <w:sz w:val="18"/>
+          <w:lang w:val="es-EC"/>
+        </w:rPr>
+        <w:t xml:space="preserve"> </w:t>
+      </w:r>
+      <w:proofErr w:type="gramStart"/>
+      <w:r>
+        <w:rPr>
+          <w:rFonts w:ascii="Consolas" w:hAnsi="Consolas"/>
+          <w:color w:val="333333"/>
+          <w:sz w:val="18"/>
+          <w:lang w:val="es-EC"/>
+        </w:rPr>
+        <w:t>... }</w:t>
+      </w:r>
+      <w:proofErr w:type="gramEnd"/>
       <w:r>
         <w:rPr>
           <w:rFonts w:ascii="Consolas" w:hAnsi="Consolas"/>
@@ -3706,6 +3967,7 @@
         <w:br/>
       </w:r>
       <w:proofErr w:type="spellStart"/>
+      <w:proofErr w:type="gramStart"/>
       <w:r>
         <w:rPr>
           <w:rFonts w:ascii="Consolas" w:hAnsi="Consolas"/>
@@ -3723,8 +3985,69 @@
           <w:sz w:val="18"/>
           <w:lang w:val="es-EC"/>
         </w:rPr>
-        <w:t>('5. Reporte')         { ... }</w:t>
-      </w:r>
+        <w:t>(</w:t>
+      </w:r>
+      <w:proofErr w:type="gramEnd"/>
+      <w:r>
+        <w:rPr>
+          <w:rFonts w:ascii="Consolas" w:hAnsi="Consolas"/>
+          <w:color w:val="333333"/>
+          <w:sz w:val="18"/>
+          <w:lang w:val="es-EC"/>
+        </w:rPr>
+        <w:t>'5. Reporte</w:t>
+      </w:r>
+      <w:proofErr w:type="gramStart"/>
+      <w:r>
+        <w:rPr>
+          <w:rFonts w:ascii="Consolas" w:hAnsi="Consolas"/>
+          <w:color w:val="333333"/>
+          <w:sz w:val="18"/>
+          <w:lang w:val="es-EC"/>
+        </w:rPr>
+        <w:t xml:space="preserve">')   </w:t>
+      </w:r>
+      <w:proofErr w:type="gramEnd"/>
+      <w:r>
+        <w:rPr>
+          <w:rFonts w:ascii="Consolas" w:hAnsi="Consolas"/>
+          <w:color w:val="333333"/>
+          <w:sz w:val="18"/>
+          <w:lang w:val="es-EC"/>
+        </w:rPr>
+        <w:t xml:space="preserve">   </w:t>
+      </w:r>
+      <w:proofErr w:type="gramStart"/>
+      <w:r>
+        <w:rPr>
+          <w:rFonts w:ascii="Consolas" w:hAnsi="Consolas"/>
+          <w:color w:val="333333"/>
+          <w:sz w:val="18"/>
+          <w:lang w:val="es-EC"/>
+        </w:rPr>
+        <w:t xml:space="preserve">   {</w:t>
+      </w:r>
+      <w:proofErr w:type="gramEnd"/>
+      <w:r>
+        <w:rPr>
+          <w:rFonts w:ascii="Consolas" w:hAnsi="Consolas"/>
+          <w:color w:val="333333"/>
+          <w:sz w:val="18"/>
+          <w:lang w:val="es-EC"/>
+        </w:rPr>
+        <w:t xml:space="preserve"> </w:t>
+      </w:r>
+      <w:proofErr w:type="gramStart"/>
+      <w:r>
+        <w:rPr>
+          <w:rFonts w:ascii="Consolas" w:hAnsi="Consolas"/>
+          <w:color w:val="333333"/>
+          <w:sz w:val="18"/>
+          <w:lang w:val="es-EC"/>
+        </w:rPr>
+        <w:t>... }</w:t>
+      </w:r>
+      <w:proofErr w:type="gramEnd"/>
     </w:p>
     <w:p>
       <w:pPr>
@@ -3929,7 +4252,21 @@
         <w:rPr>
           <w:lang w:val="es-EC"/>
         </w:rPr>
-        <w:t xml:space="preserve"> con la directiva load(), lo que permite reutilizarlos en cualquier otro proyecto sin necesidad de copiar </w:t>
+        <w:t xml:space="preserve"> con la directiva </w:t>
+      </w:r>
+      <w:proofErr w:type="gramStart"/>
+      <w:r>
+        <w:rPr>
+          <w:lang w:val="es-EC"/>
+        </w:rPr>
+        <w:t>load(</w:t>
+      </w:r>
+      <w:proofErr w:type="gramEnd"/>
+      <w:r>
+        <w:rPr>
+          <w:lang w:val="es-EC"/>
+        </w:rPr>
+        <w:t xml:space="preserve">), lo que permite reutilizarlos en cualquier otro proyecto sin necesidad de copiar </w:t>
       </w:r>
       <w:proofErr w:type="spellStart"/>
       <w:r>
@@ -3975,6 +4312,7 @@
         <w:ind w:left="283"/>
       </w:pPr>
       <w:proofErr w:type="spellStart"/>
+      <w:proofErr w:type="gramStart"/>
       <w:r>
         <w:rPr>
           <w:rFonts w:ascii="Consolas" w:hAnsi="Consolas"/>
@@ -3992,7 +4330,17 @@
           <w:sz w:val="18"/>
           <w:lang w:val="es-EC"/>
         </w:rPr>
-        <w:t xml:space="preserve">('2. </w:t>
+        <w:t>(</w:t>
+      </w:r>
+      <w:proofErr w:type="gramEnd"/>
+      <w:r>
+        <w:rPr>
+          <w:rFonts w:ascii="Consolas" w:hAnsi="Consolas"/>
+          <w:color w:val="333333"/>
+          <w:sz w:val="18"/>
+          <w:lang w:val="es-EC"/>
+        </w:rPr>
+        <w:t xml:space="preserve">'2. </w:t>
       </w:r>
       <w:r>
         <w:rPr>
@@ -4104,7 +4452,21 @@
         <w:rPr>
           <w:lang w:val="es-EC"/>
         </w:rPr>
-        <w:t xml:space="preserve"> 'ejecutar()' y termina con '</w:t>
+        <w:t xml:space="preserve"> '</w:t>
+      </w:r>
+      <w:proofErr w:type="gramStart"/>
+      <w:r>
+        <w:rPr>
+          <w:lang w:val="es-EC"/>
+        </w:rPr>
+        <w:t>ejecutar(</w:t>
+      </w:r>
+      <w:proofErr w:type="gramEnd"/>
+      <w:r>
+        <w:rPr>
+          <w:lang w:val="es-EC"/>
+        </w:rPr>
+        <w:t>)' y termina con '</w:t>
       </w:r>
       <w:proofErr w:type="spellStart"/>
       <w:r>
@@ -4149,6 +4511,7 @@
         <w:t xml:space="preserve"> </w:t>
       </w:r>
       <w:proofErr w:type="spellStart"/>
+      <w:proofErr w:type="gramStart"/>
       <w:r>
         <w:rPr>
           <w:lang w:val="es-EC"/>
@@ -4156,6 +4519,7 @@
         <w:t>test.groovy</w:t>
       </w:r>
       <w:proofErr w:type="spellEnd"/>
+      <w:proofErr w:type="gramEnd"/>
       <w:r>
         <w:rPr>
           <w:lang w:val="es-EC"/>
@@ -4248,7 +4612,27 @@
           <w:sz w:val="18"/>
           <w:lang w:val="es-EC"/>
         </w:rPr>
-        <w:t xml:space="preserve"> ejecutar(String tipo) {</w:t>
+        <w:t xml:space="preserve"> </w:t>
+      </w:r>
+      <w:proofErr w:type="gramStart"/>
+      <w:r>
+        <w:rPr>
+          <w:rFonts w:ascii="Consolas" w:hAnsi="Consolas"/>
+          <w:color w:val="333333"/>
+          <w:sz w:val="18"/>
+          <w:lang w:val="es-EC"/>
+        </w:rPr>
+        <w:t>ejecutar(</w:t>
+      </w:r>
+      <w:proofErr w:type="gramEnd"/>
+      <w:r>
+        <w:rPr>
+          <w:rFonts w:ascii="Consolas" w:hAnsi="Consolas"/>
+          <w:color w:val="333333"/>
+          <w:sz w:val="18"/>
+          <w:lang w:val="es-EC"/>
+        </w:rPr>
+        <w:t>String tipo) {</w:t>
       </w:r>
       <w:r>
         <w:rPr>
@@ -4261,6 +4645,7 @@
         <w:t xml:space="preserve">    echo "ETAPA: TEST [${</w:t>
       </w:r>
       <w:proofErr w:type="spellStart"/>
+      <w:proofErr w:type="gramStart"/>
       <w:r>
         <w:rPr>
           <w:rFonts w:ascii="Consolas" w:hAnsi="Consolas"/>
@@ -4271,6 +4656,7 @@
         <w:t>tipo.toUpperCase</w:t>
       </w:r>
       <w:proofErr w:type="spellEnd"/>
+      <w:proofErr w:type="gramEnd"/>
       <w:r>
         <w:rPr>
           <w:rFonts w:ascii="Consolas" w:hAnsi="Consolas"/>
@@ -4418,7 +4804,27 @@
           <w:sz w:val="18"/>
           <w:lang w:val="es-EC"/>
         </w:rPr>
-        <w:t>} &amp;&amp; ./${</w:t>
+        <w:t>} &amp;</w:t>
+      </w:r>
+      <w:proofErr w:type="gramStart"/>
+      <w:r>
+        <w:rPr>
+          <w:rFonts w:ascii="Consolas" w:hAnsi="Consolas"/>
+          <w:color w:val="333333"/>
+          <w:sz w:val="18"/>
+          <w:lang w:val="es-EC"/>
+        </w:rPr>
+        <w:t>&amp; .</w:t>
+      </w:r>
+      <w:proofErr w:type="gramEnd"/>
+      <w:r>
+        <w:rPr>
+          <w:rFonts w:ascii="Consolas" w:hAnsi="Consolas"/>
+          <w:color w:val="333333"/>
+          <w:sz w:val="18"/>
+          <w:lang w:val="es-EC"/>
+        </w:rPr>
+        <w:t>/${</w:t>
       </w:r>
       <w:proofErr w:type="spellStart"/>
       <w:r>
@@ -4513,8 +4919,19 @@
           <w:lang w:val="es-EC"/>
         </w:rPr>
         <w:br/>
-        <w:t>[ CAPTURA DE PANTALLA #7 ]</w:t>
-      </w:r>
+        <w:t>[ CAPTURA DE PANTALLA #</w:t>
+      </w:r>
+      <w:proofErr w:type="gramStart"/>
+      <w:r>
+        <w:rPr>
+          <w:b/>
+          <w:color w:val="2E6EB6"/>
+          <w:sz w:val="26"/>
+          <w:lang w:val="es-EC"/>
+        </w:rPr>
+        <w:t>7 ]</w:t>
+      </w:r>
+      <w:proofErr w:type="gramEnd"/>
       <w:r>
         <w:rPr>
           <w:b/>
@@ -4676,7 +5093,14 @@
         <w:rPr>
           <w:lang w:val="es-EC"/>
         </w:rPr>
-        <w:t xml:space="preserve"> { </w:t>
+        <w:t xml:space="preserve"> </w:t>
+      </w:r>
+      <w:proofErr w:type="gramStart"/>
+      <w:r>
+        <w:rPr>
+          <w:lang w:val="es-EC"/>
+        </w:rPr>
+        <w:t xml:space="preserve">{ </w:t>
       </w:r>
       <w:proofErr w:type="spellStart"/>
       <w:r>
@@ -4686,11 +5110,26 @@
         <w:t>branch</w:t>
       </w:r>
       <w:proofErr w:type="spellEnd"/>
-      <w:r>
-        <w:rPr>
-          <w:lang w:val="es-EC"/>
-        </w:rPr>
-        <w:t xml:space="preserve"> '...' }', el pipeline ejecuta diferentes etapas </w:t>
+      <w:proofErr w:type="gramEnd"/>
+      <w:r>
+        <w:rPr>
+          <w:lang w:val="es-EC"/>
+        </w:rPr>
+        <w:t xml:space="preserve"> </w:t>
+      </w:r>
+      <w:proofErr w:type="gramStart"/>
+      <w:r>
+        <w:rPr>
+          <w:lang w:val="es-EC"/>
+        </w:rPr>
+        <w:t>'...' }</w:t>
+      </w:r>
+      <w:proofErr w:type="gramEnd"/>
+      <w:r>
+        <w:rPr>
+          <w:lang w:val="es-EC"/>
+        </w:rPr>
+        <w:t xml:space="preserve">', el pipeline ejecuta diferentes etapas </w:t>
       </w:r>
       <w:proofErr w:type="spellStart"/>
       <w:r>
@@ -4767,6 +5206,7 @@
         </w:rPr>
       </w:pPr>
       <w:proofErr w:type="spellStart"/>
+      <w:proofErr w:type="gramStart"/>
       <w:r>
         <w:rPr>
           <w:rFonts w:ascii="Consolas" w:hAnsi="Consolas"/>
@@ -4784,7 +5224,17 @@
           <w:sz w:val="18"/>
           <w:lang w:val="es-EC"/>
         </w:rPr>
-        <w:t xml:space="preserve">('4. </w:t>
+        <w:t>(</w:t>
+      </w:r>
+      <w:proofErr w:type="gramEnd"/>
+      <w:r>
+        <w:rPr>
+          <w:rFonts w:ascii="Consolas" w:hAnsi="Consolas"/>
+          <w:color w:val="333333"/>
+          <w:sz w:val="18"/>
+          <w:lang w:val="es-EC"/>
+        </w:rPr>
+        <w:t xml:space="preserve">'4. </w:t>
       </w:r>
       <w:proofErr w:type="spellStart"/>
       <w:r>
@@ -4834,7 +5284,17 @@
           <w:sz w:val="18"/>
           <w:lang w:val="es-EC"/>
         </w:rPr>
-        <w:t xml:space="preserve"> { </w:t>
+        <w:t xml:space="preserve"> </w:t>
+      </w:r>
+      <w:proofErr w:type="gramStart"/>
+      <w:r>
+        <w:rPr>
+          <w:rFonts w:ascii="Consolas" w:hAnsi="Consolas"/>
+          <w:color w:val="333333"/>
+          <w:sz w:val="18"/>
+          <w:lang w:val="es-EC"/>
+        </w:rPr>
+        <w:t xml:space="preserve">{ </w:t>
       </w:r>
       <w:proofErr w:type="spellStart"/>
       <w:r>
@@ -4847,6 +5307,7 @@
         <w:t>branch</w:t>
       </w:r>
       <w:proofErr w:type="spellEnd"/>
+      <w:proofErr w:type="gramEnd"/>
       <w:r>
         <w:rPr>
           <w:rFonts w:ascii="Consolas" w:hAnsi="Consolas"/>
@@ -4867,6 +5328,7 @@
         <w:t>develop</w:t>
       </w:r>
       <w:proofErr w:type="spellEnd"/>
+      <w:proofErr w:type="gramStart"/>
       <w:r>
         <w:rPr>
           <w:rFonts w:ascii="Consolas" w:hAnsi="Consolas"/>
@@ -4876,6 +5338,7 @@
         </w:rPr>
         <w:t>' }</w:t>
       </w:r>
+      <w:proofErr w:type="gramEnd"/>
       <w:r>
         <w:rPr>
           <w:rFonts w:ascii="Consolas" w:hAnsi="Consolas"/>
@@ -4904,8 +5367,39 @@
           <w:sz w:val="18"/>
           <w:lang w:val="es-EC"/>
         </w:rPr>
-        <w:t xml:space="preserve"> { echo '&gt;&gt; Desplegando a entorno DEV' }</w:t>
-      </w:r>
+        <w:t xml:space="preserve"> </w:t>
+      </w:r>
+      <w:proofErr w:type="gramStart"/>
+      <w:r>
+        <w:rPr>
+          <w:rFonts w:ascii="Consolas" w:hAnsi="Consolas"/>
+          <w:color w:val="333333"/>
+          <w:sz w:val="18"/>
+          <w:lang w:val="es-EC"/>
+        </w:rPr>
+        <w:t>{ echo</w:t>
+      </w:r>
+      <w:proofErr w:type="gramEnd"/>
+      <w:r>
+        <w:rPr>
+          <w:rFonts w:ascii="Consolas" w:hAnsi="Consolas"/>
+          <w:color w:val="333333"/>
+          <w:sz w:val="18"/>
+          <w:lang w:val="es-EC"/>
+        </w:rPr>
+        <w:t xml:space="preserve"> '&gt;&gt; Desplegando a entorno DEV</w:t>
+      </w:r>
+      <w:proofErr w:type="gramStart"/>
+      <w:r>
+        <w:rPr>
+          <w:rFonts w:ascii="Consolas" w:hAnsi="Consolas"/>
+          <w:color w:val="333333"/>
+          <w:sz w:val="18"/>
+          <w:lang w:val="es-EC"/>
+        </w:rPr>
+        <w:t>' }</w:t>
+      </w:r>
+      <w:proofErr w:type="gramEnd"/>
       <w:r>
         <w:rPr>
           <w:rFonts w:ascii="Consolas" w:hAnsi="Consolas"/>
@@ -4935,6 +5429,7 @@
         <w:br/>
       </w:r>
       <w:proofErr w:type="spellStart"/>
+      <w:proofErr w:type="gramStart"/>
       <w:r>
         <w:rPr>
           <w:rFonts w:ascii="Consolas" w:hAnsi="Consolas"/>
@@ -4952,7 +5447,17 @@
           <w:sz w:val="18"/>
           <w:lang w:val="es-EC"/>
         </w:rPr>
-        <w:t xml:space="preserve">('4. </w:t>
+        <w:t>(</w:t>
+      </w:r>
+      <w:proofErr w:type="gramEnd"/>
+      <w:r>
+        <w:rPr>
+          <w:rFonts w:ascii="Consolas" w:hAnsi="Consolas"/>
+          <w:color w:val="333333"/>
+          <w:sz w:val="18"/>
+          <w:lang w:val="es-EC"/>
+        </w:rPr>
+        <w:t xml:space="preserve">'4. </w:t>
       </w:r>
       <w:proofErr w:type="spellStart"/>
       <w:r>
@@ -5022,7 +5527,17 @@
           <w:sz w:val="18"/>
           <w:lang w:val="es-EC"/>
         </w:rPr>
-        <w:t xml:space="preserve"> { </w:t>
+        <w:t xml:space="preserve"> </w:t>
+      </w:r>
+      <w:proofErr w:type="gramStart"/>
+      <w:r>
+        <w:rPr>
+          <w:rFonts w:ascii="Consolas" w:hAnsi="Consolas"/>
+          <w:color w:val="333333"/>
+          <w:sz w:val="18"/>
+          <w:lang w:val="es-EC"/>
+        </w:rPr>
+        <w:t xml:space="preserve">{ </w:t>
       </w:r>
       <w:proofErr w:type="spellStart"/>
       <w:r>
@@ -5035,6 +5550,7 @@
         <w:t>branch</w:t>
       </w:r>
       <w:proofErr w:type="spellEnd"/>
+      <w:proofErr w:type="gramEnd"/>
       <w:r>
         <w:rPr>
           <w:rFonts w:ascii="Consolas" w:hAnsi="Consolas"/>
@@ -5055,6 +5571,7 @@
         <w:t>main</w:t>
       </w:r>
       <w:proofErr w:type="spellEnd"/>
+      <w:proofErr w:type="gramStart"/>
       <w:r>
         <w:rPr>
           <w:rFonts w:ascii="Consolas" w:hAnsi="Consolas"/>
@@ -5064,6 +5581,7 @@
         </w:rPr>
         <w:t>' }</w:t>
       </w:r>
+      <w:proofErr w:type="gramEnd"/>
       <w:r>
         <w:rPr>
           <w:rFonts w:ascii="Consolas" w:hAnsi="Consolas"/>
@@ -5101,8 +5619,39 @@
           <w:sz w:val="18"/>
           <w:lang w:val="es-EC"/>
         </w:rPr>
-        <w:t xml:space="preserve"> { echo '&gt;&gt; Desplegando a entorno PROD' }</w:t>
-      </w:r>
+        <w:t xml:space="preserve"> </w:t>
+      </w:r>
+      <w:proofErr w:type="gramStart"/>
+      <w:r>
+        <w:rPr>
+          <w:rFonts w:ascii="Consolas" w:hAnsi="Consolas"/>
+          <w:color w:val="333333"/>
+          <w:sz w:val="18"/>
+          <w:lang w:val="es-EC"/>
+        </w:rPr>
+        <w:t>{ echo</w:t>
+      </w:r>
+      <w:proofErr w:type="gramEnd"/>
+      <w:r>
+        <w:rPr>
+          <w:rFonts w:ascii="Consolas" w:hAnsi="Consolas"/>
+          <w:color w:val="333333"/>
+          <w:sz w:val="18"/>
+          <w:lang w:val="es-EC"/>
+        </w:rPr>
+        <w:t xml:space="preserve"> '&gt;&gt; Desplegando a entorno PROD</w:t>
+      </w:r>
+      <w:proofErr w:type="gramStart"/>
+      <w:r>
+        <w:rPr>
+          <w:rFonts w:ascii="Consolas" w:hAnsi="Consolas"/>
+          <w:color w:val="333333"/>
+          <w:sz w:val="18"/>
+          <w:lang w:val="es-EC"/>
+        </w:rPr>
+        <w:t>' }</w:t>
+      </w:r>
+      <w:proofErr w:type="gramEnd"/>
       <w:r>
         <w:rPr>
           <w:rFonts w:ascii="Consolas" w:hAnsi="Consolas"/>
@@ -5711,6 +6260,7 @@
         </w:rPr>
       </w:pPr>
       <w:proofErr w:type="spellStart"/>
+      <w:proofErr w:type="gramStart"/>
       <w:r>
         <w:rPr>
           <w:rFonts w:ascii="Consolas" w:hAnsi="Consolas"/>
@@ -5728,7 +6278,17 @@
           <w:sz w:val="18"/>
           <w:lang w:val="es-EC"/>
         </w:rPr>
-        <w:t>('3. Test (Paralelo)') {</w:t>
+        <w:t>(</w:t>
+      </w:r>
+      <w:proofErr w:type="gramEnd"/>
+      <w:r>
+        <w:rPr>
+          <w:rFonts w:ascii="Consolas" w:hAnsi="Consolas"/>
+          <w:color w:val="333333"/>
+          <w:sz w:val="18"/>
+          <w:lang w:val="es-EC"/>
+        </w:rPr>
+        <w:t>'3. Test (Paralelo)') {</w:t>
       </w:r>
       <w:r>
         <w:rPr>
@@ -5771,6 +6331,7 @@
         <w:t xml:space="preserve">        </w:t>
       </w:r>
       <w:proofErr w:type="spellStart"/>
+      <w:proofErr w:type="gramStart"/>
       <w:r>
         <w:rPr>
           <w:rFonts w:ascii="Consolas" w:hAnsi="Consolas"/>
@@ -5788,7 +6349,17 @@
           <w:sz w:val="18"/>
           <w:lang w:val="es-EC"/>
         </w:rPr>
-        <w:t>('</w:t>
+        <w:t>(</w:t>
+      </w:r>
+      <w:proofErr w:type="gramEnd"/>
+      <w:r>
+        <w:rPr>
+          <w:rFonts w:ascii="Consolas" w:hAnsi="Consolas"/>
+          <w:color w:val="333333"/>
+          <w:sz w:val="18"/>
+          <w:lang w:val="es-EC"/>
+        </w:rPr>
+        <w:t>'</w:t>
       </w:r>
       <w:proofErr w:type="spellStart"/>
       <w:r>
@@ -5940,6 +6511,7 @@
         <w:t xml:space="preserve">                    </w:t>
       </w:r>
       <w:proofErr w:type="spellStart"/>
+      <w:proofErr w:type="gramStart"/>
       <w:r>
         <w:rPr>
           <w:rFonts w:ascii="Consolas" w:hAnsi="Consolas"/>
@@ -5950,6 +6522,7 @@
         <w:t>test.ejecutar</w:t>
       </w:r>
       <w:proofErr w:type="spellEnd"/>
+      <w:proofErr w:type="gramEnd"/>
       <w:r>
         <w:rPr>
           <w:rFonts w:ascii="Consolas" w:hAnsi="Consolas"/>
@@ -5987,8 +6560,19 @@
           <w:lang w:val="es-EC"/>
         </w:rPr>
         <w:br/>
-        <w:t xml:space="preserve">                }</w:t>
-      </w:r>
+        <w:t xml:space="preserve">              </w:t>
+      </w:r>
+      <w:proofErr w:type="gramStart"/>
+      <w:r>
+        <w:rPr>
+          <w:rFonts w:ascii="Consolas" w:hAnsi="Consolas"/>
+          <w:color w:val="333333"/>
+          <w:sz w:val="18"/>
+          <w:lang w:val="es-EC"/>
+        </w:rPr>
+        <w:t xml:space="preserve">  }</w:t>
+      </w:r>
+      <w:proofErr w:type="gramEnd"/>
       <w:r>
         <w:rPr>
           <w:rFonts w:ascii="Consolas" w:hAnsi="Consolas"/>
@@ -5997,8 +6581,19 @@
           <w:lang w:val="es-EC"/>
         </w:rPr>
         <w:br/>
-        <w:t xml:space="preserve">            }</w:t>
-      </w:r>
+        <w:t xml:space="preserve">          </w:t>
+      </w:r>
+      <w:proofErr w:type="gramStart"/>
+      <w:r>
+        <w:rPr>
+          <w:rFonts w:ascii="Consolas" w:hAnsi="Consolas"/>
+          <w:color w:val="333333"/>
+          <w:sz w:val="18"/>
+          <w:lang w:val="es-EC"/>
+        </w:rPr>
+        <w:t xml:space="preserve">  }</w:t>
+      </w:r>
+      <w:proofErr w:type="gramEnd"/>
       <w:r>
         <w:rPr>
           <w:rFonts w:ascii="Consolas" w:hAnsi="Consolas"/>
@@ -6007,8 +6602,19 @@
           <w:lang w:val="es-EC"/>
         </w:rPr>
         <w:br/>
-        <w:t xml:space="preserve">        }</w:t>
-      </w:r>
+        <w:t xml:space="preserve">      </w:t>
+      </w:r>
+      <w:proofErr w:type="gramStart"/>
+      <w:r>
+        <w:rPr>
+          <w:rFonts w:ascii="Consolas" w:hAnsi="Consolas"/>
+          <w:color w:val="333333"/>
+          <w:sz w:val="18"/>
+          <w:lang w:val="es-EC"/>
+        </w:rPr>
+        <w:t xml:space="preserve">  }</w:t>
+      </w:r>
+      <w:proofErr w:type="gramEnd"/>
       <w:r>
         <w:rPr>
           <w:rFonts w:ascii="Consolas" w:hAnsi="Consolas"/>
@@ -6020,6 +6626,7 @@
         <w:t xml:space="preserve">        </w:t>
       </w:r>
       <w:proofErr w:type="spellStart"/>
+      <w:proofErr w:type="gramStart"/>
       <w:r>
         <w:rPr>
           <w:rFonts w:ascii="Consolas" w:hAnsi="Consolas"/>
@@ -6037,7 +6644,17 @@
           <w:sz w:val="18"/>
           <w:lang w:val="es-EC"/>
         </w:rPr>
-        <w:t>('</w:t>
+        <w:t>(</w:t>
+      </w:r>
+      <w:proofErr w:type="gramEnd"/>
+      <w:r>
+        <w:rPr>
+          <w:rFonts w:ascii="Consolas" w:hAnsi="Consolas"/>
+          <w:color w:val="333333"/>
+          <w:sz w:val="18"/>
+          <w:lang w:val="es-EC"/>
+        </w:rPr>
+        <w:t>'</w:t>
       </w:r>
       <w:proofErr w:type="spellStart"/>
       <w:r>
@@ -6180,6 +6797,7 @@
         <w:t xml:space="preserve">                    </w:t>
       </w:r>
       <w:proofErr w:type="spellStart"/>
+      <w:proofErr w:type="gramStart"/>
       <w:r>
         <w:rPr>
           <w:rFonts w:ascii="Consolas" w:hAnsi="Consolas"/>
@@ -6190,6 +6808,7 @@
         <w:t>test.ejecutar</w:t>
       </w:r>
       <w:proofErr w:type="spellEnd"/>
+      <w:proofErr w:type="gramEnd"/>
       <w:r>
         <w:rPr>
           <w:rFonts w:ascii="Consolas" w:hAnsi="Consolas"/>
@@ -6227,8 +6846,19 @@
           <w:lang w:val="es-EC"/>
         </w:rPr>
         <w:br/>
-        <w:t xml:space="preserve">                }</w:t>
-      </w:r>
+        <w:t xml:space="preserve">              </w:t>
+      </w:r>
+      <w:proofErr w:type="gramStart"/>
+      <w:r>
+        <w:rPr>
+          <w:rFonts w:ascii="Consolas" w:hAnsi="Consolas"/>
+          <w:color w:val="333333"/>
+          <w:sz w:val="18"/>
+          <w:lang w:val="es-EC"/>
+        </w:rPr>
+        <w:t xml:space="preserve">  }</w:t>
+      </w:r>
+      <w:proofErr w:type="gramEnd"/>
       <w:r>
         <w:rPr>
           <w:rFonts w:ascii="Consolas" w:hAnsi="Consolas"/>
@@ -6237,8 +6867,19 @@
           <w:lang w:val="es-EC"/>
         </w:rPr>
         <w:br/>
-        <w:t xml:space="preserve">            }</w:t>
-      </w:r>
+        <w:t xml:space="preserve">          </w:t>
+      </w:r>
+      <w:proofErr w:type="gramStart"/>
+      <w:r>
+        <w:rPr>
+          <w:rFonts w:ascii="Consolas" w:hAnsi="Consolas"/>
+          <w:color w:val="333333"/>
+          <w:sz w:val="18"/>
+          <w:lang w:val="es-EC"/>
+        </w:rPr>
+        <w:t xml:space="preserve">  }</w:t>
+      </w:r>
+      <w:proofErr w:type="gramEnd"/>
       <w:r>
         <w:rPr>
           <w:rFonts w:ascii="Consolas" w:hAnsi="Consolas"/>
@@ -6247,8 +6888,19 @@
           <w:lang w:val="es-EC"/>
         </w:rPr>
         <w:br/>
-        <w:t xml:space="preserve">        }</w:t>
-      </w:r>
+        <w:t xml:space="preserve">      </w:t>
+      </w:r>
+      <w:proofErr w:type="gramStart"/>
+      <w:r>
+        <w:rPr>
+          <w:rFonts w:ascii="Consolas" w:hAnsi="Consolas"/>
+          <w:color w:val="333333"/>
+          <w:sz w:val="18"/>
+          <w:lang w:val="es-EC"/>
+        </w:rPr>
+        <w:t xml:space="preserve">  }</w:t>
+      </w:r>
+      <w:proofErr w:type="gramEnd"/>
       <w:r>
         <w:rPr>
           <w:rFonts w:ascii="Consolas" w:hAnsi="Consolas"/>
@@ -6257,8 +6909,19 @@
           <w:lang w:val="es-EC"/>
         </w:rPr>
         <w:br/>
-        <w:t xml:space="preserve">    }</w:t>
-      </w:r>
+        <w:t xml:space="preserve">  </w:t>
+      </w:r>
+      <w:proofErr w:type="gramStart"/>
+      <w:r>
+        <w:rPr>
+          <w:rFonts w:ascii="Consolas" w:hAnsi="Consolas"/>
+          <w:color w:val="333333"/>
+          <w:sz w:val="18"/>
+          <w:lang w:val="es-EC"/>
+        </w:rPr>
+        <w:t xml:space="preserve">  }</w:t>
+      </w:r>
+      <w:proofErr w:type="gramEnd"/>
       <w:r>
         <w:rPr>
           <w:rFonts w:ascii="Consolas" w:hAnsi="Consolas"/>
@@ -6416,14 +7079,25 @@
           <w:lang w:val="es-EC"/>
         </w:rPr>
       </w:pPr>
-      <w:r>
-        <w:rPr>
-          <w:rFonts w:ascii="Consolas" w:hAnsi="Consolas"/>
-          <w:color w:val="333333"/>
-          <w:sz w:val="18"/>
-          <w:lang w:val="es-EC"/>
-        </w:rPr>
-        <w:t>#!/bin/bash</w:t>
+      <w:proofErr w:type="gramStart"/>
+      <w:r>
+        <w:rPr>
+          <w:rFonts w:ascii="Consolas" w:hAnsi="Consolas"/>
+          <w:color w:val="333333"/>
+          <w:sz w:val="18"/>
+          <w:lang w:val="es-EC"/>
+        </w:rPr>
+        <w:t>#!/</w:t>
+      </w:r>
+      <w:proofErr w:type="gramEnd"/>
+      <w:r>
+        <w:rPr>
+          <w:rFonts w:ascii="Consolas" w:hAnsi="Consolas"/>
+          <w:color w:val="333333"/>
+          <w:sz w:val="18"/>
+          <w:lang w:val="es-EC"/>
+        </w:rPr>
+        <w:t>bin/bash</w:t>
       </w:r>
       <w:r>
         <w:rPr>
@@ -6521,7 +7195,27 @@
           <w:sz w:val="18"/>
           <w:lang w:val="es-EC"/>
         </w:rPr>
-        <w:t xml:space="preserve">/app.js" ]; </w:t>
+        <w:t>/app.js</w:t>
+      </w:r>
+      <w:proofErr w:type="gramStart"/>
+      <w:r>
+        <w:rPr>
+          <w:rFonts w:ascii="Consolas" w:hAnsi="Consolas"/>
+          <w:color w:val="333333"/>
+          <w:sz w:val="18"/>
+          <w:lang w:val="es-EC"/>
+        </w:rPr>
+        <w:t>" ]</w:t>
+      </w:r>
+      <w:proofErr w:type="gramEnd"/>
+      <w:r>
+        <w:rPr>
+          <w:rFonts w:ascii="Consolas" w:hAnsi="Consolas"/>
+          <w:color w:val="333333"/>
+          <w:sz w:val="18"/>
+          <w:lang w:val="es-EC"/>
+        </w:rPr>
+        <w:t xml:space="preserve">; </w:t>
       </w:r>
       <w:proofErr w:type="spellStart"/>
       <w:r>
@@ -6542,7 +7236,27 @@
           <w:lang w:val="es-EC"/>
         </w:rPr>
         <w:br/>
-        <w:t xml:space="preserve">    echo "  [PASS] </w:t>
+        <w:t xml:space="preserve">    echo </w:t>
+      </w:r>
+      <w:proofErr w:type="gramStart"/>
+      <w:r>
+        <w:rPr>
+          <w:rFonts w:ascii="Consolas" w:hAnsi="Consolas"/>
+          <w:color w:val="333333"/>
+          <w:sz w:val="18"/>
+          <w:lang w:val="es-EC"/>
+        </w:rPr>
+        <w:t>"  [</w:t>
+      </w:r>
+      <w:proofErr w:type="gramEnd"/>
+      <w:r>
+        <w:rPr>
+          <w:rFonts w:ascii="Consolas" w:hAnsi="Consolas"/>
+          <w:color w:val="333333"/>
+          <w:sz w:val="18"/>
+          <w:lang w:val="es-EC"/>
+        </w:rPr>
+        <w:t xml:space="preserve">PASS] </w:t>
       </w:r>
       <w:proofErr w:type="spellStart"/>
       <w:r>
@@ -6592,7 +7306,27 @@
           <w:lang w:val="es-EC"/>
         </w:rPr>
         <w:br/>
-        <w:t xml:space="preserve">    echo "  [FAIL] </w:t>
+        <w:t xml:space="preserve">    echo </w:t>
+      </w:r>
+      <w:proofErr w:type="gramStart"/>
+      <w:r>
+        <w:rPr>
+          <w:rFonts w:ascii="Consolas" w:hAnsi="Consolas"/>
+          <w:color w:val="333333"/>
+          <w:sz w:val="18"/>
+          <w:lang w:val="es-EC"/>
+        </w:rPr>
+        <w:t>"  [</w:t>
+      </w:r>
+      <w:proofErr w:type="gramEnd"/>
+      <w:r>
+        <w:rPr>
+          <w:rFonts w:ascii="Consolas" w:hAnsi="Consolas"/>
+          <w:color w:val="333333"/>
+          <w:sz w:val="18"/>
+          <w:lang w:val="es-EC"/>
+        </w:rPr>
+        <w:t xml:space="preserve">FAIL] </w:t>
       </w:r>
       <w:proofErr w:type="spellStart"/>
       <w:r>
@@ -6781,7 +7515,27 @@
           <w:lang w:val="es-EC"/>
         </w:rPr>
         <w:br/>
-        <w:t xml:space="preserve">    echo "  [PASS] </w:t>
+        <w:t xml:space="preserve">    echo </w:t>
+      </w:r>
+      <w:proofErr w:type="gramStart"/>
+      <w:r>
+        <w:rPr>
+          <w:rFonts w:ascii="Consolas" w:hAnsi="Consolas"/>
+          <w:color w:val="333333"/>
+          <w:sz w:val="18"/>
+          <w:lang w:val="es-EC"/>
+        </w:rPr>
+        <w:t>"  [</w:t>
+      </w:r>
+      <w:proofErr w:type="gramEnd"/>
+      <w:r>
+        <w:rPr>
+          <w:rFonts w:ascii="Consolas" w:hAnsi="Consolas"/>
+          <w:color w:val="333333"/>
+          <w:sz w:val="18"/>
+          <w:lang w:val="es-EC"/>
+        </w:rPr>
+        <w:t xml:space="preserve">PASS] </w:t>
       </w:r>
       <w:proofErr w:type="spellStart"/>
       <w:r>
@@ -6929,14 +7683,25 @@
           <w:lang w:val="es-EC"/>
         </w:rPr>
       </w:pPr>
-      <w:r>
-        <w:rPr>
-          <w:rFonts w:ascii="Consolas" w:hAnsi="Consolas"/>
-          <w:color w:val="333333"/>
-          <w:sz w:val="18"/>
-          <w:lang w:val="es-EC"/>
-        </w:rPr>
-        <w:t>#!/bin/bash</w:t>
+      <w:proofErr w:type="gramStart"/>
+      <w:r>
+        <w:rPr>
+          <w:rFonts w:ascii="Consolas" w:hAnsi="Consolas"/>
+          <w:color w:val="333333"/>
+          <w:sz w:val="18"/>
+          <w:lang w:val="es-EC"/>
+        </w:rPr>
+        <w:t>#!/</w:t>
+      </w:r>
+      <w:proofErr w:type="gramEnd"/>
+      <w:r>
+        <w:rPr>
+          <w:rFonts w:ascii="Consolas" w:hAnsi="Consolas"/>
+          <w:color w:val="333333"/>
+          <w:sz w:val="18"/>
+          <w:lang w:val="es-EC"/>
+        </w:rPr>
+        <w:t>bin/bash</w:t>
       </w:r>
       <w:r>
         <w:rPr>
@@ -6988,14 +7753,25 @@
         <w:t>src</w:t>
       </w:r>
       <w:proofErr w:type="spellEnd"/>
-      <w:r>
-        <w:rPr>
-          <w:rFonts w:ascii="Consolas" w:hAnsi="Consolas"/>
-          <w:color w:val="333333"/>
-          <w:sz w:val="18"/>
-          <w:lang w:val="es-EC"/>
-        </w:rPr>
-        <w:t>" ] &amp;&amp; [ -d "</w:t>
+      <w:proofErr w:type="gramStart"/>
+      <w:r>
+        <w:rPr>
+          <w:rFonts w:ascii="Consolas" w:hAnsi="Consolas"/>
+          <w:color w:val="333333"/>
+          <w:sz w:val="18"/>
+          <w:lang w:val="es-EC"/>
+        </w:rPr>
+        <w:t>" ]</w:t>
+      </w:r>
+      <w:proofErr w:type="gramEnd"/>
+      <w:r>
+        <w:rPr>
+          <w:rFonts w:ascii="Consolas" w:hAnsi="Consolas"/>
+          <w:color w:val="333333"/>
+          <w:sz w:val="18"/>
+          <w:lang w:val="es-EC"/>
+        </w:rPr>
+        <w:t xml:space="preserve"> &amp;&amp; [ -d "</w:t>
       </w:r>
       <w:proofErr w:type="spellStart"/>
       <w:r>
@@ -7008,14 +7784,45 @@
         <w:t>tests</w:t>
       </w:r>
       <w:proofErr w:type="spellEnd"/>
-      <w:r>
-        <w:rPr>
-          <w:rFonts w:ascii="Consolas" w:hAnsi="Consolas"/>
-          <w:color w:val="333333"/>
-          <w:sz w:val="18"/>
-          <w:lang w:val="es-EC"/>
-        </w:rPr>
-        <w:t xml:space="preserve">" ] &amp;&amp; [ -d "pipeline" ]; </w:t>
+      <w:proofErr w:type="gramStart"/>
+      <w:r>
+        <w:rPr>
+          <w:rFonts w:ascii="Consolas" w:hAnsi="Consolas"/>
+          <w:color w:val="333333"/>
+          <w:sz w:val="18"/>
+          <w:lang w:val="es-EC"/>
+        </w:rPr>
+        <w:t>" ]</w:t>
+      </w:r>
+      <w:proofErr w:type="gramEnd"/>
+      <w:r>
+        <w:rPr>
+          <w:rFonts w:ascii="Consolas" w:hAnsi="Consolas"/>
+          <w:color w:val="333333"/>
+          <w:sz w:val="18"/>
+          <w:lang w:val="es-EC"/>
+        </w:rPr>
+        <w:t xml:space="preserve"> &amp;&amp; [ -d "pipeline</w:t>
+      </w:r>
+      <w:proofErr w:type="gramStart"/>
+      <w:r>
+        <w:rPr>
+          <w:rFonts w:ascii="Consolas" w:hAnsi="Consolas"/>
+          <w:color w:val="333333"/>
+          <w:sz w:val="18"/>
+          <w:lang w:val="es-EC"/>
+        </w:rPr>
+        <w:t>" ]</w:t>
+      </w:r>
+      <w:proofErr w:type="gramEnd"/>
+      <w:r>
+        <w:rPr>
+          <w:rFonts w:ascii="Consolas" w:hAnsi="Consolas"/>
+          <w:color w:val="333333"/>
+          <w:sz w:val="18"/>
+          <w:lang w:val="es-EC"/>
+        </w:rPr>
+        <w:t xml:space="preserve">; </w:t>
       </w:r>
       <w:proofErr w:type="spellStart"/>
       <w:r>
@@ -7036,7 +7843,27 @@
           <w:lang w:val="es-EC"/>
         </w:rPr>
         <w:br/>
-        <w:t xml:space="preserve">    echo "  [PASS] Estructura del proyecto correcta"</w:t>
+        <w:t xml:space="preserve">    echo </w:t>
+      </w:r>
+      <w:proofErr w:type="gramStart"/>
+      <w:r>
+        <w:rPr>
+          <w:rFonts w:ascii="Consolas" w:hAnsi="Consolas"/>
+          <w:color w:val="333333"/>
+          <w:sz w:val="18"/>
+          <w:lang w:val="es-EC"/>
+        </w:rPr>
+        <w:t>"  [</w:t>
+      </w:r>
+      <w:proofErr w:type="gramEnd"/>
+      <w:r>
+        <w:rPr>
+          <w:rFonts w:ascii="Consolas" w:hAnsi="Consolas"/>
+          <w:color w:val="333333"/>
+          <w:sz w:val="18"/>
+          <w:lang w:val="es-EC"/>
+        </w:rPr>
+        <w:t>PASS] Estructura del proyecto correcta"</w:t>
       </w:r>
       <w:r>
         <w:rPr>
@@ -7138,14 +7965,25 @@
         <w:t>Jenkinsfile</w:t>
       </w:r>
       <w:proofErr w:type="spellEnd"/>
-      <w:r>
-        <w:rPr>
-          <w:rFonts w:ascii="Consolas" w:hAnsi="Consolas"/>
-          <w:color w:val="333333"/>
-          <w:sz w:val="18"/>
-          <w:lang w:val="es-EC"/>
-        </w:rPr>
-        <w:t xml:space="preserve">" ]; </w:t>
+      <w:proofErr w:type="gramStart"/>
+      <w:r>
+        <w:rPr>
+          <w:rFonts w:ascii="Consolas" w:hAnsi="Consolas"/>
+          <w:color w:val="333333"/>
+          <w:sz w:val="18"/>
+          <w:lang w:val="es-EC"/>
+        </w:rPr>
+        <w:t>" ]</w:t>
+      </w:r>
+      <w:proofErr w:type="gramEnd"/>
+      <w:r>
+        <w:rPr>
+          <w:rFonts w:ascii="Consolas" w:hAnsi="Consolas"/>
+          <w:color w:val="333333"/>
+          <w:sz w:val="18"/>
+          <w:lang w:val="es-EC"/>
+        </w:rPr>
+        <w:t xml:space="preserve">; </w:t>
       </w:r>
       <w:proofErr w:type="spellStart"/>
       <w:r>
@@ -7175,7 +8013,27 @@
           <w:lang w:val="es-EC"/>
         </w:rPr>
         <w:lastRenderedPageBreak/>
-        <w:t xml:space="preserve">    echo "  [PASS] </w:t>
+        <w:t xml:space="preserve">    echo </w:t>
+      </w:r>
+      <w:proofErr w:type="gramStart"/>
+      <w:r>
+        <w:rPr>
+          <w:rFonts w:ascii="Consolas" w:hAnsi="Consolas"/>
+          <w:color w:val="333333"/>
+          <w:sz w:val="18"/>
+          <w:lang w:val="es-EC"/>
+        </w:rPr>
+        <w:t>"  [</w:t>
+      </w:r>
+      <w:proofErr w:type="gramEnd"/>
+      <w:r>
+        <w:rPr>
+          <w:rFonts w:ascii="Consolas" w:hAnsi="Consolas"/>
+          <w:color w:val="333333"/>
+          <w:sz w:val="18"/>
+          <w:lang w:val="es-EC"/>
+        </w:rPr>
+        <w:t xml:space="preserve">PASS] </w:t>
       </w:r>
       <w:proofErr w:type="spellStart"/>
       <w:r>
@@ -7901,7 +8759,27 @@
           <w:sz w:val="18"/>
           <w:lang w:val="es-EC"/>
         </w:rPr>
-        <w:t xml:space="preserve">[UNIT TEST]        [PASS] </w:t>
+        <w:t xml:space="preserve">[UNIT TEST]     </w:t>
+      </w:r>
+      <w:proofErr w:type="gramStart"/>
+      <w:r>
+        <w:rPr>
+          <w:rFonts w:ascii="Consolas" w:hAnsi="Consolas"/>
+          <w:color w:val="333333"/>
+          <w:sz w:val="18"/>
+          <w:lang w:val="es-EC"/>
+        </w:rPr>
+        <w:t xml:space="preserve">   [</w:t>
+      </w:r>
+      <w:proofErr w:type="gramEnd"/>
+      <w:r>
+        <w:rPr>
+          <w:rFonts w:ascii="Consolas" w:hAnsi="Consolas"/>
+          <w:color w:val="333333"/>
+          <w:sz w:val="18"/>
+          <w:lang w:val="es-EC"/>
+        </w:rPr>
+        <w:t xml:space="preserve">PASS] </w:t>
       </w:r>
       <w:proofErr w:type="spellStart"/>
       <w:r>
@@ -7931,7 +8809,27 @@
           <w:lang w:val="es-EC"/>
         </w:rPr>
         <w:br/>
-        <w:t xml:space="preserve">[UNIT TEST]        [PASS] </w:t>
+        <w:t xml:space="preserve">[UNIT TEST]     </w:t>
+      </w:r>
+      <w:proofErr w:type="gramStart"/>
+      <w:r>
+        <w:rPr>
+          <w:rFonts w:ascii="Consolas" w:hAnsi="Consolas"/>
+          <w:color w:val="333333"/>
+          <w:sz w:val="18"/>
+          <w:lang w:val="es-EC"/>
+        </w:rPr>
+        <w:t xml:space="preserve">   [</w:t>
+      </w:r>
+      <w:proofErr w:type="gramEnd"/>
+      <w:r>
+        <w:rPr>
+          <w:rFonts w:ascii="Consolas" w:hAnsi="Consolas"/>
+          <w:color w:val="333333"/>
+          <w:sz w:val="18"/>
+          <w:lang w:val="es-EC"/>
+        </w:rPr>
+        <w:t xml:space="preserve">PASS] </w:t>
       </w:r>
       <w:proofErr w:type="spellStart"/>
       <w:r>
@@ -8013,6 +8911,7 @@
         <w:t xml:space="preserve">&gt;&gt; </w:t>
       </w:r>
       <w:proofErr w:type="spellStart"/>
+      <w:proofErr w:type="gramStart"/>
       <w:r>
         <w:rPr>
           <w:rFonts w:ascii="Consolas" w:hAnsi="Consolas"/>
@@ -8030,7 +8929,17 @@
           <w:sz w:val="18"/>
           <w:lang w:val="es-EC"/>
         </w:rPr>
-        <w:t xml:space="preserve"> : </w:t>
+        <w:t xml:space="preserve"> :</w:t>
+      </w:r>
+      <w:proofErr w:type="gramEnd"/>
+      <w:r>
+        <w:rPr>
+          <w:rFonts w:ascii="Consolas" w:hAnsi="Consolas"/>
+          <w:color w:val="333333"/>
+          <w:sz w:val="18"/>
+          <w:lang w:val="es-EC"/>
+        </w:rPr>
+        <w:t xml:space="preserve"> </w:t>
       </w:r>
       <w:proofErr w:type="spellStart"/>
       <w:r>
@@ -8080,7 +8989,27 @@
           <w:sz w:val="18"/>
           <w:lang w:val="es-EC"/>
         </w:rPr>
-        <w:t xml:space="preserve">    : 1.0.4</w:t>
+        <w:t xml:space="preserve">  </w:t>
+      </w:r>
+      <w:proofErr w:type="gramStart"/>
+      <w:r>
+        <w:rPr>
+          <w:rFonts w:ascii="Consolas" w:hAnsi="Consolas"/>
+          <w:color w:val="333333"/>
+          <w:sz w:val="18"/>
+          <w:lang w:val="es-EC"/>
+        </w:rPr>
+        <w:t xml:space="preserve">  :</w:t>
+      </w:r>
+      <w:proofErr w:type="gramEnd"/>
+      <w:r>
+        <w:rPr>
+          <w:rFonts w:ascii="Consolas" w:hAnsi="Consolas"/>
+          <w:color w:val="333333"/>
+          <w:sz w:val="18"/>
+          <w:lang w:val="es-EC"/>
+        </w:rPr>
+        <w:t xml:space="preserve"> 1.0.4</w:t>
       </w:r>
       <w:r>
         <w:rPr>
@@ -8090,7 +9019,27 @@
           <w:lang w:val="es-EC"/>
         </w:rPr>
         <w:br/>
-        <w:t>&gt;&gt; Resultado  : OK</w:t>
+        <w:t xml:space="preserve">&gt;&gt; </w:t>
+      </w:r>
+      <w:proofErr w:type="gramStart"/>
+      <w:r>
+        <w:rPr>
+          <w:rFonts w:ascii="Consolas" w:hAnsi="Consolas"/>
+          <w:color w:val="333333"/>
+          <w:sz w:val="18"/>
+          <w:lang w:val="es-EC"/>
+        </w:rPr>
+        <w:t>Resultado  :</w:t>
+      </w:r>
+      <w:proofErr w:type="gramEnd"/>
+      <w:r>
+        <w:rPr>
+          <w:rFonts w:ascii="Consolas" w:hAnsi="Consolas"/>
+          <w:color w:val="333333"/>
+          <w:sz w:val="18"/>
+          <w:lang w:val="es-EC"/>
+        </w:rPr>
+        <w:t xml:space="preserve"> OK</w:t>
       </w:r>
       <w:r>
         <w:rPr>
@@ -8447,7 +9396,17 @@
           <w:sz w:val="18"/>
           <w:lang w:val="es-EC"/>
         </w:rPr>
-        <w:t>-*.</w:t>
+        <w:t>-</w:t>
+      </w:r>
+      <w:proofErr w:type="gramStart"/>
+      <w:r>
+        <w:rPr>
+          <w:rFonts w:ascii="Consolas" w:hAnsi="Consolas"/>
+          <w:color w:val="333333"/>
+          <w:sz w:val="18"/>
+          <w:lang w:val="es-EC"/>
+        </w:rPr>
+        <w:t>*.</w:t>
       </w:r>
       <w:proofErr w:type="spellStart"/>
       <w:r>
@@ -8460,6 +9419,7 @@
         <w:t>json</w:t>
       </w:r>
       <w:proofErr w:type="spellEnd"/>
+      <w:proofErr w:type="gramEnd"/>
       <w:r>
         <w:rPr>
           <w:rFonts w:ascii="Consolas" w:hAnsi="Consolas"/>
@@ -8627,14 +9587,28 @@
               <w:rPr>
                 <w:sz w:val="20"/>
               </w:rPr>
-              <w:t xml:space="preserve"> la flag -</w:t>
+              <w:t xml:space="preserve"> la flag </w:t>
+            </w:r>
+            <w:proofErr w:type="gramStart"/>
+            <w:r>
+              <w:rPr>
+                <w:sz w:val="20"/>
+              </w:rPr>
+              <w:t>-</w:t>
             </w:r>
             <w:proofErr w:type="spellStart"/>
             <w:r>
               <w:rPr>
                 <w:sz w:val="20"/>
               </w:rPr>
-              <w:t>Dhudson.plugins.git.GitSCM.ALLOW_LOCAL_CHECKOUT</w:t>
+              <w:t>Dhudson.plugins.git.GitSCM.ALLOW</w:t>
+            </w:r>
+            <w:proofErr w:type="gramEnd"/>
+            <w:r>
+              <w:rPr>
+                <w:sz w:val="20"/>
+              </w:rPr>
+              <w:t>_LOCAL_CHECKOUT</w:t>
             </w:r>
             <w:proofErr w:type="spellEnd"/>
             <w:r>
@@ -8689,12 +9663,21 @@
               <w:t xml:space="preserve">Se reemplazo por </w:t>
             </w:r>
             <w:proofErr w:type="spellStart"/>
+            <w:proofErr w:type="gramStart"/>
             <w:r>
               <w:rPr>
                 <w:sz w:val="20"/>
                 <w:lang w:val="es-EC"/>
               </w:rPr>
-              <w:t>env.BRANCH_NAME</w:t>
+              <w:t>env.BRANCH</w:t>
+            </w:r>
+            <w:proofErr w:type="gramEnd"/>
+            <w:r>
+              <w:rPr>
+                <w:sz w:val="20"/>
+                <w:lang w:val="es-EC"/>
+              </w:rPr>
+              <w:t>_NAME</w:t>
             </w:r>
             <w:proofErr w:type="spellEnd"/>
             <w:r>
@@ -8722,12 +9705,21 @@
                 <w:lang w:val="es-EC"/>
               </w:rPr>
             </w:pPr>
+            <w:proofErr w:type="gramStart"/>
             <w:r>
               <w:rPr>
                 <w:sz w:val="20"/>
                 <w:lang w:val="es-EC"/>
               </w:rPr>
-              <w:t xml:space="preserve">El test de </w:t>
+              <w:t>El test</w:t>
+            </w:r>
+            <w:proofErr w:type="gramEnd"/>
+            <w:r>
+              <w:rPr>
+                <w:sz w:val="20"/>
+                <w:lang w:val="es-EC"/>
+              </w:rPr>
+              <w:t xml:space="preserve"> de </w:t>
             </w:r>
             <w:proofErr w:type="spellStart"/>
             <w:r>
@@ -8902,11 +9894,19 @@
           <w:lang w:val="es-EC"/>
         </w:rPr>
       </w:pPr>
-      <w:r>
-        <w:rPr>
-          <w:lang w:val="es-EC"/>
-        </w:rPr>
-        <w:t xml:space="preserve">La modularidad mediante archivos </w:t>
+      <w:proofErr w:type="gramStart"/>
+      <w:r>
+        <w:rPr>
+          <w:lang w:val="es-EC"/>
+        </w:rPr>
+        <w:t>La modularidad</w:t>
+      </w:r>
+      <w:proofErr w:type="gramEnd"/>
+      <w:r>
+        <w:rPr>
+          <w:lang w:val="es-EC"/>
+        </w:rPr>
+        <w:t xml:space="preserve"> mediante archivos </w:t>
       </w:r>
       <w:proofErr w:type="spellStart"/>
       <w:r>
@@ -8920,7 +9920,21 @@
         <w:rPr>
           <w:lang w:val="es-EC"/>
         </w:rPr>
-        <w:t xml:space="preserve"> cargados con load() permite reutilizar </w:t>
+        <w:t xml:space="preserve"> cargados con </w:t>
+      </w:r>
+      <w:proofErr w:type="gramStart"/>
+      <w:r>
+        <w:rPr>
+          <w:lang w:val="es-EC"/>
+        </w:rPr>
+        <w:t>load(</w:t>
+      </w:r>
+      <w:proofErr w:type="gramEnd"/>
+      <w:r>
+        <w:rPr>
+          <w:lang w:val="es-EC"/>
+        </w:rPr>
+        <w:t xml:space="preserve">) permite reutilizar </w:t>
       </w:r>
       <w:proofErr w:type="spellStart"/>
       <w:r>
@@ -8990,7 +10004,14 @@
         <w:rPr>
           <w:lang w:val="es-EC"/>
         </w:rPr>
-        <w:t xml:space="preserve"> { </w:t>
+        <w:t xml:space="preserve"> </w:t>
+      </w:r>
+      <w:proofErr w:type="gramStart"/>
+      <w:r>
+        <w:rPr>
+          <w:lang w:val="es-EC"/>
+        </w:rPr>
+        <w:t xml:space="preserve">{ </w:t>
       </w:r>
       <w:proofErr w:type="spellStart"/>
       <w:r>
@@ -9000,6 +10021,7 @@
         <w:t>branch</w:t>
       </w:r>
       <w:proofErr w:type="spellEnd"/>
+      <w:proofErr w:type="gramEnd"/>
       <w:r>
         <w:rPr>
           <w:lang w:val="es-EC"/>
@@ -9018,7 +10040,21 @@
         <w:rPr>
           <w:lang w:val="es-EC"/>
         </w:rPr>
-        <w:t xml:space="preserve"> continua diferenciada por rama en Jenkins.</w:t>
+        <w:t xml:space="preserve"> </w:t>
+      </w:r>
+      <w:proofErr w:type="gramStart"/>
+      <w:r>
+        <w:rPr>
+          <w:lang w:val="es-EC"/>
+        </w:rPr>
+        <w:t>continua</w:t>
+      </w:r>
+      <w:proofErr w:type="gramEnd"/>
+      <w:r>
+        <w:rPr>
+          <w:lang w:val="es-EC"/>
+        </w:rPr>
+        <w:t xml:space="preserve"> diferenciada por rama en Jenkins.</w:t>
       </w:r>
     </w:p>
     <w:p>

</xml_diff>